<commit_message>
Initial secure backend upload
</commit_message>
<xml_diff>
--- a/Irrixa API info.docx
+++ b/Irrixa API info.docx
@@ -40,7 +40,7 @@
         <w:rPr>
           <w:lang w:val="en-US"/>
         </w:rPr>
-        <w:t>7cb7154c-6c15-421c-a5d9-f5a08c48fb2b</w:t>
+        <w:t>d8e99b7c-cb42-42dc-b0e1-63331625eefd</w:t>
       </w:r>
     </w:p>
     <w:p>
@@ -59,7 +59,7 @@
         <w:rPr>
           <w:lang w:val="en-US"/>
         </w:rPr>
-        <w:t>Fa6ZN1GMLeHNlhHfkxvFz7a7iw2amYr6</w:t>
+        <w:t>BJWlNjvQOw5a95TAJQNjkCyObQCM8wZE</w:t>
       </w:r>
     </w:p>
     <w:sectPr>

</xml_diff>